<commit_message>
DA exercises: follow the notation register (L_r, Δh); extend the register
The model scale is now the length ratio L_r (λ stays the Darcy friction
factor) across DA-1–DA-3: cards, briefs, the scale-tanks slider label,
rig scripts, the pooled plot and its CSV column. The head over the weir
crest in DA-3 is Δh (H stays the energy head), including the regenerated
tutorial sheets; DA-2's Torricelli derivation is written in η and Δh.

docs/notation.md gains Δh (driving head of a discharge law), λ (Darcy,
not 4f), the m/p/r model–prototype convention with L_r as the scale, and
Re, We, C_d.

Co-Authored-By: Claude Opus 5.5 <noreply@anthropic.com>
Claude-Session: https://claude.ai/code/session_01QdiUwTBJbFkiP61sDF7765
</commit_message>
<xml_diff>
--- a/exercises/DA-3-weir-model-study/tutorial-sheet-questions.docx
+++ b/exercises/DA-3-weir-model-study/tutorial-sheet-questions.docx
@@ -131,7 +131,7 @@
           <w:b w:val="0"/>
           <w:i w:val="0"/>
         </w:rPr>
-        <w:t>The discharge per metre width q over the weir depends on the head H, the crest height P, the crest length L</w:t>
+        <w:t>The discharge per metre width q over the weir depends on the head Δh, the crest height P, the crest length L</w:t>
       </w:r>
       <w:r>
         <w:rPr>
@@ -158,7 +158,7 @@
           <w:b w:val="0"/>
           <w:i w:val="0"/>
         </w:rPr>
-        <w:t>(a) How many Π groups describe the problem? Using ρ, g and H as repeating variables, find them.</w:t>
+        <w:t>(a) How many Π groups describe the problem? Using ρ, g and Δh as repeating variables, find them.</w:t>
       </w:r>
     </w:p>
     <w:p>
@@ -185,7 +185,7 @@
           <w:b w:val="0"/>
           <w:i w:val="0"/>
         </w:rPr>
-        <w:t xml:space="preserve"> √g H</w:t>
+        <w:t xml:space="preserve"> √g Δh</w:t>
       </w:r>
       <w:r>
         <w:rPr>
@@ -215,7 +215,7 @@
           <w:b w:val="0"/>
           <w:i w:val="0"/>
         </w:rPr>
-        <w:t xml:space="preserve"> = φ(H/P, L</w:t>
+        <w:t xml:space="preserve"> = φ(Δh/P, L</w:t>
       </w:r>
       <w:r>
         <w:rPr>
@@ -230,52 +230,7 @@
           <w:b w:val="0"/>
           <w:i w:val="0"/>
         </w:rPr>
-        <w:t>/H, Re</w:t>
-      </w:r>
-      <w:r>
-        <w:rPr>
-          <w:b w:val="0"/>
-          <w:i w:val="0"/>
-          <w:vertAlign w:val="subscript"/>
-        </w:rPr>
-        <w:t>H</w:t>
-      </w:r>
-      <w:r>
-        <w:rPr>
-          <w:b w:val="0"/>
-          <w:i w:val="0"/>
-        </w:rPr>
-        <w:t>, We</w:t>
-      </w:r>
-      <w:r>
-        <w:rPr>
-          <w:b w:val="0"/>
-          <w:i w:val="0"/>
-          <w:vertAlign w:val="subscript"/>
-        </w:rPr>
-        <w:t>H</w:t>
-      </w:r>
-      <w:r>
-        <w:rPr>
-          <w:b w:val="0"/>
-          <w:i w:val="0"/>
-        </w:rPr>
-        <w:t>), where Re</w:t>
-      </w:r>
-      <w:r>
-        <w:rPr>
-          <w:b w:val="0"/>
-          <w:i w:val="0"/>
-          <w:vertAlign w:val="subscript"/>
-        </w:rPr>
-        <w:t>H</w:t>
-      </w:r>
-      <w:r>
-        <w:rPr>
-          <w:b w:val="0"/>
-          <w:i w:val="0"/>
-        </w:rPr>
-        <w:t xml:space="preserve"> = ρ√g H</w:t>
+        <w:t>/Δh, Re, We), where Re = ρ√g Δh</w:t>
       </w:r>
       <w:r>
         <w:rPr>
@@ -290,52 +245,7 @@
           <w:b w:val="0"/>
           <w:i w:val="0"/>
         </w:rPr>
-        <w:t>/μ and We</w:t>
-      </w:r>
-      <w:r>
-        <w:rPr>
-          <w:b w:val="0"/>
-          <w:i w:val="0"/>
-          <w:vertAlign w:val="subscript"/>
-        </w:rPr>
-        <w:t>H</w:t>
-      </w:r>
-      <w:r>
-        <w:rPr>
-          <w:b w:val="0"/>
-          <w:i w:val="0"/>
-        </w:rPr>
-        <w:t xml:space="preserve"> = ρgH²/σ. Which force ratio does each of Re</w:t>
-      </w:r>
-      <w:r>
-        <w:rPr>
-          <w:b w:val="0"/>
-          <w:i w:val="0"/>
-          <w:vertAlign w:val="subscript"/>
-        </w:rPr>
-        <w:t>H</w:t>
-      </w:r>
-      <w:r>
-        <w:rPr>
-          <w:b w:val="0"/>
-          <w:i w:val="0"/>
-        </w:rPr>
-        <w:t xml:space="preserve"> and We</w:t>
-      </w:r>
-      <w:r>
-        <w:rPr>
-          <w:b w:val="0"/>
-          <w:i w:val="0"/>
-          <w:vertAlign w:val="subscript"/>
-        </w:rPr>
-        <w:t>H</w:t>
-      </w:r>
-      <w:r>
-        <w:rPr>
-          <w:b w:val="0"/>
-          <w:i w:val="0"/>
-        </w:rPr>
-        <w:t xml:space="preserve"> compare?</w:t>
+        <w:t>/μ and We = ρgΔh²/σ. Which force ratio does each of Re and We compare?</w:t>
       </w:r>
     </w:p>
     <w:p>
@@ -360,37 +270,7 @@
           <w:b w:val="0"/>
           <w:i w:val="0"/>
         </w:rPr>
-        <w:t>(a) Which dimensionless group must be the same in model and prototype for gravity-dominated flow over a weir, and why can Re</w:t>
-      </w:r>
-      <w:r>
-        <w:rPr>
-          <w:b w:val="0"/>
-          <w:i w:val="0"/>
-          <w:vertAlign w:val="subscript"/>
-        </w:rPr>
-        <w:t>H</w:t>
-      </w:r>
-      <w:r>
-        <w:rPr>
-          <w:b w:val="0"/>
-          <w:i w:val="0"/>
-        </w:rPr>
-        <w:t xml:space="preserve"> and We</w:t>
-      </w:r>
-      <w:r>
-        <w:rPr>
-          <w:b w:val="0"/>
-          <w:i w:val="0"/>
-          <w:vertAlign w:val="subscript"/>
-        </w:rPr>
-        <w:t>H</w:t>
-      </w:r>
-      <w:r>
-        <w:rPr>
-          <w:b w:val="0"/>
-          <w:i w:val="0"/>
-        </w:rPr>
-        <w:t xml:space="preserve"> not be matched at the same time with water in both?</w:t>
+        <w:t>(a) Which dimensionless group must be the same in model and prototype for gravity-dominated flow over a weir, and why can Re and We not be matched at the same time with water in both?</w:t>
       </w:r>
     </w:p>
     <w:p>
@@ -402,7 +282,45 @@
           <w:b w:val="0"/>
           <w:i w:val="0"/>
         </w:rPr>
-        <w:t>(b) For λ = ½ and λ = ¼ find the model crest height, crest length and the discharge per metre width that must be supplied. (In this vertical slice q is per metre, so it scales as λ</w:t>
+        <w:t>(b) For L</w:t>
+      </w:r>
+      <w:r>
+        <w:rPr>
+          <w:b w:val="0"/>
+          <w:i w:val="0"/>
+          <w:vertAlign w:val="subscript"/>
+        </w:rPr>
+        <w:t>r</w:t>
+      </w:r>
+      <w:r>
+        <w:rPr>
+          <w:b w:val="0"/>
+          <w:i w:val="0"/>
+        </w:rPr>
+        <w:t xml:space="preserve"> = ½ and L</w:t>
+      </w:r>
+      <w:r>
+        <w:rPr>
+          <w:b w:val="0"/>
+          <w:i w:val="0"/>
+          <w:vertAlign w:val="subscript"/>
+        </w:rPr>
+        <w:t>r</w:t>
+      </w:r>
+      <w:r>
+        <w:rPr>
+          <w:b w:val="0"/>
+          <w:i w:val="0"/>
+        </w:rPr>
+        <w:t xml:space="preserve"> = ¼ find the model crest height, crest length and the discharge per metre width that must be supplied. (In this vertical slice q is per metre, so it scales as L</w:t>
+      </w:r>
+      <w:r>
+        <w:rPr>
+          <w:b w:val="0"/>
+          <w:i w:val="0"/>
+          <w:vertAlign w:val="subscript"/>
+        </w:rPr>
+        <w:t>r</w:t>
       </w:r>
       <w:r>
         <w:rPr>
@@ -417,7 +335,15 @@
           <w:b w:val="0"/>
           <w:i w:val="0"/>
         </w:rPr>
-        <w:t>, not λ</w:t>
+        <w:t>, not L</w:t>
+      </w:r>
+      <w:r>
+        <w:rPr>
+          <w:b w:val="0"/>
+          <w:i w:val="0"/>
+          <w:vertAlign w:val="subscript"/>
+        </w:rPr>
+        <w:t>r</w:t>
       </w:r>
       <w:r>
         <w:rPr>
@@ -484,7 +410,7 @@
           <w:b w:val="0"/>
           <w:i w:val="0"/>
         </w:rPr>
-        <w:t xml:space="preserve"> √g H</w:t>
+        <w:t xml:space="preserve"> √g Δh</w:t>
       </w:r>
       <w:r>
         <w:rPr>
@@ -526,7 +452,7 @@
           <w:b w:val="0"/>
           <w:i w:val="0"/>
         </w:rPr>
-        <w:t>(b) If the prototype head turns out to be H</w:t>
+        <w:t>(b) If the prototype head turns out to be Δh</w:t>
       </w:r>
       <w:r>
         <w:rPr>
@@ -581,7 +507,7 @@
           <w:b w:val="0"/>
           <w:i w:val="0"/>
         </w:rPr>
-        <w:t>For each rung (the box on the card: 0 = prototype, 1 = 1:2, 2 = 1:4) set Inflow q to your value from 2(b) (0.780 m²/s for the prototype) and the Reservoir level printed on the card, press R, wait for the settle, then read the steady approach-pool depth d on a gauge at the card's station. Compute H = d − P and C</w:t>
+        <w:t>For each rung (the box on the card: 0 = prototype, 1 = 1:2, 2 = 1:4) set Inflow q to your value from 2(b) (0.780 m²/s for the prototype) and the Reservoir level printed on the card, press R, wait for the settle, then read the steady approach-pool depth d on a gauge at the card's station. Compute Δh = d − P and C</w:t>
       </w:r>
       <w:r>
         <w:rPr>
@@ -629,7 +555,24 @@
                 <w:i w:val="0"/>
                 <w:sz w:val="19"/>
               </w:rPr>
-              <w:t>prototype λ = 1</w:t>
+              <w:t>prototype L</w:t>
+            </w:r>
+            <w:r>
+              <w:rPr>
+                <w:b/>
+                <w:i w:val="0"/>
+                <w:sz w:val="19"/>
+                <w:vertAlign w:val="subscript"/>
+              </w:rPr>
+              <w:t>r</w:t>
+            </w:r>
+            <w:r>
+              <w:rPr>
+                <w:b/>
+                <w:i w:val="0"/>
+                <w:sz w:val="19"/>
+              </w:rPr>
+              <w:t xml:space="preserve"> = 1</w:t>
             </w:r>
           </w:p>
         </w:tc>
@@ -835,7 +778,7 @@
                 <w:i w:val="0"/>
                 <w:sz w:val="19"/>
               </w:rPr>
-              <w:t>H = d − P (m)</w:t>
+              <w:t>Δh = d − P (m)</w:t>
             </w:r>
           </w:p>
         </w:tc>
@@ -870,7 +813,24 @@
                 <w:i w:val="0"/>
                 <w:sz w:val="19"/>
               </w:rPr>
-              <w:t>H predicted = λH</w:t>
+              <w:t>Δh predicted = L</w:t>
+            </w:r>
+            <w:r>
+              <w:rPr>
+                <w:b/>
+                <w:i w:val="0"/>
+                <w:sz w:val="19"/>
+                <w:vertAlign w:val="subscript"/>
+              </w:rPr>
+              <w:t>r</w:t>
+            </w:r>
+            <w:r>
+              <w:rPr>
+                <w:b/>
+                <w:i w:val="0"/>
+                <w:sz w:val="19"/>
+              </w:rPr>
+              <w:t>Δh</w:t>
             </w:r>
             <w:r>
               <w:rPr>
@@ -982,37 +942,7 @@
           <w:b w:val="0"/>
           <w:i w:val="0"/>
         </w:rPr>
-        <w:t>(a) Evaluate Re</w:t>
-      </w:r>
-      <w:r>
-        <w:rPr>
-          <w:b w:val="0"/>
-          <w:i w:val="0"/>
-          <w:vertAlign w:val="subscript"/>
-        </w:rPr>
-        <w:t>H</w:t>
-      </w:r>
-      <w:r>
-        <w:rPr>
-          <w:b w:val="0"/>
-          <w:i w:val="0"/>
-        </w:rPr>
-        <w:t xml:space="preserve"> and We</w:t>
-      </w:r>
-      <w:r>
-        <w:rPr>
-          <w:b w:val="0"/>
-          <w:i w:val="0"/>
-          <w:vertAlign w:val="subscript"/>
-        </w:rPr>
-        <w:t>H</w:t>
-      </w:r>
-      <w:r>
-        <w:rPr>
-          <w:b w:val="0"/>
-          <w:i w:val="0"/>
-        </w:rPr>
-        <w:t xml:space="preserve"> for the prototype and both models, with ν = 1.0×10⁻⁶ m²/s and σ = 0.073 N/m. Would a real 1:4 model of this weir, in water, suffer from viscous or surface-tension scale effects?</w:t>
+        <w:t>(a) Evaluate Re and We for the prototype and both models, with ν = 1.0×10⁻⁶ m²/s and σ = 0.073 N/m. Would a real 1:4 model of this weir, in water, suffer from viscous or surface-tension scale effects?</w:t>
       </w:r>
     </w:p>
     <w:p>
@@ -1049,7 +979,7 @@
           <w:b w:val="0"/>
           <w:i w:val="0"/>
         </w:rPr>
-        <w:t>The app has no real viscosity or surface tension at these scales; its equivalent is the grid. Its cells are Δx = 21.7 mm at Medium and do not shrink with the model. How many cells span H on each rung? If H needs at least about 8 cells to be resolved, what is the smallest model this simulation can represent at Medium? What would you expect to happen to C</w:t>
+        <w:t>The app has no real viscosity or surface tension at these scales; its equivalent is the grid. Its cells are Δx = 21.7 mm at Medium and do not shrink with the model. How many cells span Δh on each rung? If Δh needs at least about 8 cells to be resolved, what is the smallest model this simulation can represent at Medium? What would you expect to happen to C</w:t>
       </w:r>
       <w:r>
         <w:rPr>
@@ -1064,7 +994,22 @@
           <w:b w:val="0"/>
           <w:i w:val="0"/>
         </w:rPr>
-        <w:t xml:space="preserve"> at λ = ¼ on a coarser grid?</w:t>
+        <w:t xml:space="preserve"> at L</w:t>
+      </w:r>
+      <w:r>
+        <w:rPr>
+          <w:b w:val="0"/>
+          <w:i w:val="0"/>
+          <w:vertAlign w:val="subscript"/>
+        </w:rPr>
+        <w:t>r</w:t>
+      </w:r>
+      <w:r>
+        <w:rPr>
+          <w:b w:val="0"/>
+          <w:i w:val="0"/>
+        </w:rPr>
+        <w:t xml:space="preserve"> = ¼ on a coarser grid?</w:t>
       </w:r>
     </w:p>
     <w:sectPr>

</xml_diff>